<commit_message>
Document vehicle proximity detection in the FYP report
Adds section 4.3.7 to Chapter 4, giving the implementation counterpart to
the vehicle proximity warning proposed in section 3.3.3. Covers why a
second detector was required, the person-height normalisation used to
approximate distance from a single camera, the persistence filter, and
the configuration and degradation behaviour.

States verification status honestly: unit tests plus a still-image trial
against the real detector, with live site footage still outstanding. Also
records the two known limitations, the absent forklift class and the
same-depth assumption behind image-plane measurement.

Written as prose without new tables or figures, matching the neighbouring
subsections and avoiding renumbering Table 4.7 onward.

Co-Authored-By: Claude Opus 5 <noreply@anthropic.com>
</commit_message>
<xml_diff>
--- a/docs/SiteSafe_FYP_Report_V7.docx
+++ b/docs/SiteSafe_FYP_Report_V7.docx
@@ -19127,6 +19127,96 @@
     </w:p>
     <w:p>
       <w:pPr>
+        <w:pStyle w:val="Heading3"/>
+        <w:rPr/>
+      </w:pPr>
+      <w:r>
+        <w:rPr>
+          <w:rtl w:val="0"/>
+        </w:rPr>
+        <w:t xml:space="preserve">4.3.7 Vehicle Proximity Detection</w:t>
+      </w:r>
+    </w:p>
+    <w:p>
+      <w:pPr>
+        <w:spacing w:after="120" w:lineRule="auto"/>
+        <w:jc w:val="both"/>
+        <w:rPr/>
+      </w:pPr>
+      <w:r>
+        <w:rPr>
+          <w:rtl w:val="0"/>
+        </w:rPr>
+        <w:t xml:space="preserve">Section 3.3.3 proposes a vehicle proximity warning that raises an alert when a worker and a moving vehicle occupy dangerously close ground. This could not be derived from the PPE model described in Section 4.3.1, which is trained purely on equipment classes and has neither a person class nor a vehicle class. Proximity therefore requires a second detector. A COCO-pretrained YOLOv11 nano model runs alongside the PPE model and supplies the person and vehicle bounding boxes the proximity calculation consumes. Following the same sampling strategy used for pose estimation in Section 4.3.4, the proximity detector is evaluated on every third frame rather than every frame; people and vehicles move slowly relative to the capture rate, so the intermediate frames carry no information the calculation needs, and the PPE model continues to process every frame unaffected.</w:t>
+      </w:r>
+    </w:p>
+    <w:p>
+      <w:pPr>
+        <w:spacing w:after="120" w:lineRule="auto"/>
+        <w:jc w:val="both"/>
+        <w:rPr/>
+      </w:pPr>
+      <w:r>
+        <w:rPr>
+          <w:rtl w:val="0"/>
+        </w:rPr>
+        <w:t xml:space="preserve">A single camera provides no depth information, so proximity is necessarily measured in the image plane rather than as a true metric distance. The system computes the shortest edge-to-edge distance in pixels between a person box and a vehicle box, then divides that distance by the person’s bounding-box height. Pixel height acts as a rough proxy for how far a worker stands from the lens, since a worker close to the camera is tall in pixels and one further away is short. Expressing the threshold in person-heights therefore makes it approximately scale-invariant: the same setting corresponds to roughly the same real-world separation at both ends of the frame. The default threshold of one person-height corresponds to approximately 1.7 metres when the worker and the vehicle stand at comparable distance from the camera.</w:t>
+      </w:r>
+    </w:p>
+    <w:p>
+      <w:pPr>
+        <w:spacing w:after="120" w:lineRule="auto"/>
+        <w:jc w:val="both"/>
+        <w:rPr/>
+      </w:pPr>
+      <w:r>
+        <w:rPr>
+          <w:rtl w:val="0"/>
+        </w:rPr>
+        <w:t xml:space="preserve">Raw detections fluctuate between frames, and a single spurious box should not raise an alarm. A breach must therefore persist across three consecutive evaluated frames before it is confirmed, applying the same reasoning as the persistence filter used for fall detection in Section 4.3.4. Once an alert has been raised the detector will not raise another until the condition clears, which prevents a worker standing beside a parked vehicle from generating a continuous stream of alerts. Severity is assigned from the geometry: boxes that overlap indicate the worker reads as being inside the vehicle’s footprint and are escalated to CRITICAL, while a worker merely within the threshold distance produces a HIGH severity alert.</w:t>
+      </w:r>
+    </w:p>
+    <w:p>
+      <w:pPr>
+        <w:spacing w:after="120" w:lineRule="auto"/>
+        <w:jc w:val="both"/>
+        <w:rPr/>
+      </w:pPr>
+      <w:r>
+        <w:rPr>
+          <w:rtl w:val="0"/>
+        </w:rPr>
+        <w:t xml:space="preserve">Both the threshold and the persistence requirement are configurable at runtime, and proximity detection can be disabled entirely so that the pipeline runs PPE detection alone on slower hardware or on a camera covering an area with no vehicle traffic. If the second model’s weights are absent the pipeline logs a warning and continues with PPE detection rather than failing to start. On the backend, a VEHICLE_PROXIMITY alert type was added to the alert schema, and the dashboard’s incident log filters and simulation panel were extended to include it.</w:t>
+      </w:r>
+    </w:p>
+    <w:p>
+      <w:pPr>
+        <w:spacing w:after="120" w:lineRule="auto"/>
+        <w:jc w:val="both"/>
+        <w:rPr/>
+      </w:pPr>
+      <w:r>
+        <w:rPr>
+          <w:rtl w:val="0"/>
+        </w:rPr>
+        <w:t xml:space="preserve">The proximity decision logic is implemented in a module deliberately kept free of camera and model imports, which allows it to be tested without loading weights or opening a video source. Unit tests cover the geometry for overlapping, touching, adjacent and diagonally separated boxes, confirm that the person-height normalisation is scale-invariant, and verify that the persistence filter withholds an alert until the required number of frames has elapsed, does not re-fire while a condition persists, and resets correctly when a streak is interrupted. The full path was then exercised against the real pretrained detector on a still image containing several people standing beside a bus: the detector returned four person boxes and one vehicle box, the geometry resolved to an overlapping pair, and a CRITICAL alert payload was produced, while a synthetically distanced vehicle in the same frame correctly produced no alert across repeated frames. The resulting alert was accepted by the API and rendered in the dashboard incident log.</w:t>
+      </w:r>
+    </w:p>
+    <w:p>
+      <w:pPr>
+        <w:spacing w:after="120" w:lineRule="auto"/>
+        <w:jc w:val="both"/>
+        <w:rPr/>
+      </w:pPr>
+      <w:r>
+        <w:rPr>
+          <w:rtl w:val="0"/>
+        </w:rPr>
+        <w:t xml:space="preserve">Two limitations should be stated plainly. First, the COCO class set contains no forklift category, so forklifts and comparable industrial plant are detected as trucks or cars; the warning still fires, but the vehicle is described imprecisely, and a purpose-trained vehicle model would be required for accurate classification. Second, the image-plane measurement assumes the worker and the vehicle are at comparable distance from the camera. Where that assumption fails, most obviously when a worker stands well in front of a distant vehicle so that the two boxes overlap in the image while being far apart in reality, the system over-reports. Validation to date covers the unit tests and the still-image trial described above; the module has not yet been evaluated against live site footage or against real industrial plant, which is the next verification step.</w:t>
+      </w:r>
+    </w:p>
+    <w:p>
+      <w:pPr>
         <w:pStyle w:val="Heading2"/>
         <w:rPr/>
       </w:pPr>

</xml_diff>